<commit_message>
Agrega link del repositorio dentro del documento
</commit_message>
<xml_diff>
--- a/dashboard/Dashboard_KPIs.docx
+++ b/dashboard/Dashboard_KPIs.docx
@@ -355,15 +355,7 @@
           <w:sz w:val="28"/>
           <w:szCs w:val="28"/>
         </w:rPr>
-        <w:t>Calidad del software</w:t>
-      </w:r>
-      <w:r>
-        <w:rPr>
-          <w:color w:val="AEAAAA" w:themeColor="background2" w:themeShade="BF"/>
-          <w:sz w:val="28"/>
-          <w:szCs w:val="28"/>
-        </w:rPr>
-        <w:t xml:space="preserve"> II</w:t>
+        <w:t>Calidad del software II</w:t>
       </w:r>
       <w:r>
         <w:rPr>
@@ -634,17 +626,7 @@
           <w:szCs w:val="23"/>
           <w:shd w:val="clear" w:color="auto" w:fill="FFFFFF"/>
         </w:rPr>
-        <w:t>JEFERSON URREGO GUERRERO</w:t>
-      </w:r>
-      <w:r>
-        <w:rPr>
-          <w:rFonts w:ascii="Arial" w:hAnsi="Arial" w:cs="Arial"/>
-          <w:color w:val="AEAAAA" w:themeColor="background2" w:themeShade="BF"/>
-          <w:sz w:val="23"/>
-          <w:szCs w:val="23"/>
-          <w:shd w:val="clear" w:color="auto" w:fill="FFFFFF"/>
-        </w:rPr>
-        <w:t>.</w:t>
+        <w:t>JEFERSON URREGO GUERRERO.</w:t>
       </w:r>
     </w:p>
     <w:p>
@@ -684,7 +666,7 @@
           <w:sz w:val="28"/>
           <w:szCs w:val="28"/>
         </w:rPr>
-        <w:t>2</w:t>
+        <w:t>26</w:t>
       </w:r>
       <w:r>
         <w:rPr>
@@ -692,7 +674,7 @@
           <w:sz w:val="28"/>
           <w:szCs w:val="28"/>
         </w:rPr>
-        <w:t>6</w:t>
+        <w:t>-</w:t>
       </w:r>
       <w:r>
         <w:rPr>
@@ -700,23 +682,7 @@
           <w:sz w:val="28"/>
           <w:szCs w:val="28"/>
         </w:rPr>
-        <w:t>-</w:t>
-      </w:r>
-      <w:r>
-        <w:rPr>
-          <w:color w:val="AEAAAA" w:themeColor="background2" w:themeShade="BF"/>
-          <w:sz w:val="28"/>
-          <w:szCs w:val="28"/>
-        </w:rPr>
-        <w:t>0</w:t>
-      </w:r>
-      <w:r>
-        <w:rPr>
-          <w:color w:val="AEAAAA" w:themeColor="background2" w:themeShade="BF"/>
-          <w:sz w:val="28"/>
-          <w:szCs w:val="28"/>
-        </w:rPr>
-        <w:t>9</w:t>
+        <w:t>09</w:t>
       </w:r>
       <w:r>
         <w:rPr>
@@ -885,6 +851,48 @@
     </w:p>
     <w:p>
       <w:pPr>
+        <w:spacing w:after="40"/>
+        <w:rPr>
+          <w:b/>
+          <w:bCs/>
+        </w:rPr>
+      </w:pPr>
+      <w:r>
+        <w:rPr>
+          <w:b/>
+          <w:bCs/>
+        </w:rPr>
+        <w:t>LINK:</w:t>
+      </w:r>
+    </w:p>
+    <w:p>
+      <w:pPr>
+        <w:spacing w:after="40"/>
+        <w:rPr>
+          <w:color w:val="2F5FAD"/>
+          <w:sz w:val="48"/>
+          <w:szCs w:val="48"/>
+          <w:u w:val="single"/>
+        </w:rPr>
+      </w:pPr>
+      <w:hyperlink r:id="rId8" w:history="1">
+        <w:r>
+          <w:rPr>
+            <w:rStyle w:val="Hipervnculo"/>
+            <w:sz w:val="48"/>
+            <w:szCs w:val="48"/>
+          </w:rPr>
+          <w:t>https://github.com/Matiasv18/prueba-rendimiento-quickpizza/tree/main/dashboard</w:t>
+        </w:r>
+      </w:hyperlink>
+    </w:p>
+    <w:p>
+      <w:pPr>
+        <w:spacing w:after="40"/>
+      </w:pPr>
+    </w:p>
+    <w:p>
+      <w:pPr>
         <w:jc w:val="both"/>
         <w:rPr>
           <w:rFonts w:ascii="Calibri Light" w:hAnsi="Calibri Light" w:cs="Calibri Light"/>
@@ -1030,7 +1038,7 @@
           <w:sz w:val="24"/>
           <w:szCs w:val="24"/>
         </w:rPr>
-        <w:t xml:space="preserve">El segundo KPI es más revelador precisamente porque, a primera vista, parece un problema: el SLO exigía ≥15 req/s y el dashboard muestra apenas 7.60 req/s en carga y 6.13 req/s en resistencia, cumpliéndose solo en estrés (18.43 req/s). La pregunta que vale la pena hacerse no es si se cumplió el número, sino por qué no se cumplió, y ahí es donde el análisis se vuelve útil. El script modela un think time de 1 a 4 segundos entre acciones, lo que produce una iteración promedio de ~4.85 segundos; dado que cada iteración genera 2 solicitudes, el techo matemático de throughput por VU es de apenas ~0.41 req/s, independientemente de qué tan rápido responda el servidor. Multiplicado por 15-20 VUs, ese techo cae justo en el rango de 6-8 req/s que efectivamente se observó. En otras palabras, el patrón no es una cola de saturación del backend sino un límite estructural impuesto por el propio diseño del modelo de carga, y la prueba de esto es que la latencia (KPI 1) no se degrada mientras el throughput </w:t>
+        <w:t xml:space="preserve">El segundo KPI es más revelador precisamente porque, a primera vista, parece un problema: el SLO exigía ≥15 req/s y el dashboard muestra apenas 7.60 req/s en carga y 6.13 req/s en resistencia, cumpliéndose solo en estrés (18.43 req/s). La pregunta que vale la pena hacerse no es si se cumplió el número, sino por qué no se cumplió, y ahí es donde el análisis se vuelve útil. El script modela un think </w:t>
       </w:r>
       <w:r>
         <w:rPr>
@@ -1039,7 +1047,23 @@
           <w:szCs w:val="24"/>
         </w:rPr>
         <w:lastRenderedPageBreak/>
-        <w:t>sube junto con los VUs en estrés. Confundir este hallazgo con una falla de capacidad llevaría a invertir esfuerzo de optimización donde no hace falta.</w:t>
+        <w:t xml:space="preserve">time de 1 a 4 segundos entre acciones, lo que produce una iteración promedio de ~4.85 segundos; dado que cada iteración genera 2 solicitudes, el techo matemático de throughput por VU es de apenas ~0.41 req/s, independientemente de qué tan rápido responda el servidor. Multiplicado por 15-20 VUs, ese techo cae justo en el rango de 6-8 req/s que efectivamente se observó. En otras palabras, el patrón no es una cola de saturación del </w:t>
+      </w:r>
+      <w:r>
+        <w:rPr>
+          <w:rFonts w:ascii="Calibri Light" w:hAnsi="Calibri Light" w:cs="Calibri Light"/>
+          <w:sz w:val="24"/>
+          <w:szCs w:val="24"/>
+        </w:rPr>
+        <w:t>Backend</w:t>
+      </w:r>
+      <w:r>
+        <w:rPr>
+          <w:rFonts w:ascii="Calibri Light" w:hAnsi="Calibri Light" w:cs="Calibri Light"/>
+          <w:sz w:val="24"/>
+          <w:szCs w:val="24"/>
+        </w:rPr>
+        <w:t xml:space="preserve"> sino un límite estructural impuesto por el propio diseño del modelo de carga, y la prueba de esto es que la latencia (KPI 1) no se degrada mientras el throughput sube junto con los VUs en estrés. Confundir este hallazgo con una falla de capacidad llevaría a invertir esfuerzo de optimización donde no hace falta.</w:t>
       </w:r>
     </w:p>
     <w:p>
@@ -1565,14 +1589,103 @@
           <w:szCs w:val="24"/>
         </w:rPr>
       </w:pPr>
-      <w:r>
-        <w:rPr>
-          <w:rFonts w:ascii="Calibri Light" w:hAnsi="Calibri Light" w:cs="Calibri Light"/>
-          <w:b/>
-          <w:bCs/>
-          <w:sz w:val="24"/>
-          <w:szCs w:val="24"/>
-        </w:rPr>
+    </w:p>
+    <w:p>
+      <w:pPr>
+        <w:rPr>
+          <w:rFonts w:ascii="Calibri Light" w:hAnsi="Calibri Light" w:cs="Calibri Light"/>
+          <w:b/>
+          <w:bCs/>
+          <w:sz w:val="24"/>
+          <w:szCs w:val="24"/>
+        </w:rPr>
+      </w:pPr>
+    </w:p>
+    <w:p>
+      <w:pPr>
+        <w:rPr>
+          <w:rFonts w:ascii="Calibri Light" w:hAnsi="Calibri Light" w:cs="Calibri Light"/>
+          <w:b/>
+          <w:bCs/>
+          <w:sz w:val="24"/>
+          <w:szCs w:val="24"/>
+        </w:rPr>
+      </w:pPr>
+    </w:p>
+    <w:p>
+      <w:pPr>
+        <w:rPr>
+          <w:rFonts w:ascii="Calibri Light" w:hAnsi="Calibri Light" w:cs="Calibri Light"/>
+          <w:b/>
+          <w:bCs/>
+          <w:sz w:val="24"/>
+          <w:szCs w:val="24"/>
+        </w:rPr>
+      </w:pPr>
+    </w:p>
+    <w:p>
+      <w:pPr>
+        <w:rPr>
+          <w:rFonts w:ascii="Calibri Light" w:hAnsi="Calibri Light" w:cs="Calibri Light"/>
+          <w:b/>
+          <w:bCs/>
+          <w:sz w:val="24"/>
+          <w:szCs w:val="24"/>
+        </w:rPr>
+      </w:pPr>
+    </w:p>
+    <w:p>
+      <w:pPr>
+        <w:rPr>
+          <w:rFonts w:ascii="Calibri Light" w:hAnsi="Calibri Light" w:cs="Calibri Light"/>
+          <w:b/>
+          <w:bCs/>
+          <w:sz w:val="24"/>
+          <w:szCs w:val="24"/>
+        </w:rPr>
+      </w:pPr>
+    </w:p>
+    <w:p>
+      <w:pPr>
+        <w:rPr>
+          <w:rFonts w:ascii="Calibri Light" w:hAnsi="Calibri Light" w:cs="Calibri Light"/>
+          <w:b/>
+          <w:bCs/>
+          <w:sz w:val="24"/>
+          <w:szCs w:val="24"/>
+        </w:rPr>
+      </w:pPr>
+    </w:p>
+    <w:p>
+      <w:pPr>
+        <w:rPr>
+          <w:rFonts w:ascii="Calibri Light" w:hAnsi="Calibri Light" w:cs="Calibri Light"/>
+          <w:b/>
+          <w:bCs/>
+          <w:sz w:val="24"/>
+          <w:szCs w:val="24"/>
+        </w:rPr>
+      </w:pPr>
+    </w:p>
+    <w:p>
+      <w:pPr>
+        <w:rPr>
+          <w:rFonts w:ascii="Calibri Light" w:hAnsi="Calibri Light" w:cs="Calibri Light"/>
+          <w:b/>
+          <w:bCs/>
+          <w:sz w:val="24"/>
+          <w:szCs w:val="24"/>
+        </w:rPr>
+      </w:pPr>
+      <w:r>
+        <w:rPr>
+          <w:rFonts w:ascii="Calibri Light" w:hAnsi="Calibri Light" w:cs="Calibri Light"/>
+          <w:b/>
+          <w:bCs/>
+          <w:sz w:val="24"/>
+          <w:szCs w:val="24"/>
+        </w:rPr>
+        <w:lastRenderedPageBreak/>
         <w:t>Referencias</w:t>
       </w:r>
     </w:p>
@@ -1596,6 +1709,7 @@
           <w:rFonts w:ascii="Calibri Light" w:hAnsi="Calibri Light" w:cs="Calibri Light"/>
           <w:sz w:val="24"/>
           <w:szCs w:val="24"/>
+          <w:lang w:val="en-US"/>
         </w:rPr>
         <w:t xml:space="preserve">Beyer, B., Murphy, N. R., Rensin, D. K., Kawahara, K., &amp; Thorne, S. (Eds.). </w:t>
       </w:r>
@@ -1690,8 +1804,8 @@
       </w:r>
     </w:p>
     <w:sectPr>
-      <w:headerReference w:type="default" r:id="rId8"/>
-      <w:footerReference w:type="default" r:id="rId9"/>
+      <w:headerReference w:type="default" r:id="rId9"/>
+      <w:footerReference w:type="default" r:id="rId10"/>
       <w:pgSz w:w="12240" w:h="15840"/>
       <w:pgMar w:top="1080" w:right="1080" w:bottom="1080" w:left="1080" w:header="708" w:footer="708" w:gutter="0"/>
       <w:pgNumType w:start="0"/>
@@ -1868,25 +1982,7 @@
         <w:sz w:val="28"/>
         <w:szCs w:val="28"/>
       </w:rPr>
-      <w:t>D</w:t>
-    </w:r>
-    <w:r>
-      <w:rPr>
-        <w:bCs/>
-        <w:color w:val="AEAAAA" w:themeColor="background2" w:themeShade="BF"/>
-        <w:sz w:val="28"/>
-        <w:szCs w:val="28"/>
-      </w:rPr>
-      <w:t>ashboard de rendimiento y recomendaciones</w:t>
-    </w:r>
-    <w:r>
-      <w:rPr>
-        <w:bCs/>
-        <w:color w:val="AEAAAA" w:themeColor="background2" w:themeShade="BF"/>
-        <w:sz w:val="28"/>
-        <w:szCs w:val="28"/>
-      </w:rPr>
-      <w:t>.</w:t>
+      <w:t>Dashboard de rendimiento y recomendaciones.</w:t>
     </w:r>
   </w:p>
   <w:p>
@@ -2946,6 +3042,18 @@
       </w:tcPr>
     </w:tblStylePr>
   </w:style>
+  <w:style w:type="character" w:styleId="Mencinsinresolver">
+    <w:name w:val="Unresolved Mention"/>
+    <w:basedOn w:val="Fuentedeprrafopredeter"/>
+    <w:uiPriority w:val="99"/>
+    <w:semiHidden/>
+    <w:unhideWhenUsed/>
+    <w:rsid w:val="00D04C7A"/>
+    <w:rPr>
+      <w:color w:val="605E5C"/>
+      <w:shd w:val="clear" w:color="auto" w:fill="E1DFDD"/>
+    </w:rPr>
+  </w:style>
 </w:styles>
 </file>
 

</xml_diff>